<commit_message>
JSON, circuit bulder + un peu de app
</commit_message>
<xml_diff>
--- a/énoncé_APP4.docx
+++ b/énoncé_APP4.docx
@@ -2429,17 +2429,54 @@
           <w:rFonts w:cstheme="minorHAnsi"/>
           <w:b/>
           <w:bCs/>
+          <w:highlight w:val="yellow"/>
+        </w:rPr>
+        <w:t>Notez que toutes vos classes seront évaluées sur leur respect des bonnes pratiques</w:t>
+      </w:r>
+      <w:r>
+        <w:rPr>
+          <w:rFonts w:cstheme="minorHAnsi"/>
+          <w:b/>
+          <w:bCs/>
+          <w:highlight w:val="yellow"/>
+        </w:rPr>
+        <w:t xml:space="preserve"> et leur optimisation</w:t>
+      </w:r>
+      <w:r>
+        <w:rPr>
+          <w:rFonts w:cstheme="minorHAnsi"/>
+          <w:b/>
+          <w:bCs/>
+          <w:highlight w:val="yellow"/>
+        </w:rPr>
+        <w:t>.</w:t>
+      </w:r>
+    </w:p>
+    <w:p>
+      <w:pPr>
+        <w:rPr>
+          <w:rFonts w:ascii="Calibri" w:hAnsi="Calibri" w:cs="Calibri"/>
+          <w:b/>
+          <w:bCs/>
+          <w:color w:val="000000"/>
+        </w:rPr>
+      </w:pPr>
+      <w:r>
+        <w:rPr>
+          <w:rFonts w:cstheme="minorHAnsi"/>
+          <w:b/>
+          <w:bCs/>
           <w:noProof/>
           <w:highlight w:val="yellow"/>
         </w:rPr>
         <w:drawing>
-          <wp:anchor distT="0" distB="0" distL="114300" distR="114300" simplePos="0" relativeHeight="251658243" behindDoc="0" locked="0" layoutInCell="1" allowOverlap="1" wp14:anchorId="67CEBDC8" wp14:editId="483439CB">
+          <wp:anchor distT="0" distB="0" distL="114300" distR="114300" simplePos="0" relativeHeight="251658243" behindDoc="0" locked="0" layoutInCell="1" allowOverlap="1" wp14:anchorId="67CEBDC8" wp14:editId="1321BFAF">
             <wp:simplePos x="0" y="0"/>
-            <wp:positionH relativeFrom="column">
-              <wp:posOffset>523240</wp:posOffset>
+            <wp:positionH relativeFrom="margin">
+              <wp:align>center</wp:align>
             </wp:positionH>
             <wp:positionV relativeFrom="paragraph">
-              <wp:posOffset>521335</wp:posOffset>
+              <wp:posOffset>230505</wp:posOffset>
             </wp:positionV>
             <wp:extent cx="6038850" cy="3352800"/>
             <wp:effectExtent l="0" t="0" r="0" b="0"/>
@@ -2495,43 +2532,6 @@
           </wp:anchor>
         </w:drawing>
       </w:r>
-      <w:r>
-        <w:rPr>
-          <w:rFonts w:cstheme="minorHAnsi"/>
-          <w:b/>
-          <w:bCs/>
-          <w:highlight w:val="yellow"/>
-        </w:rPr>
-        <w:t>Notez que toutes vos classes seront évaluées sur leur respect des bonnes pratiques</w:t>
-      </w:r>
-      <w:r>
-        <w:rPr>
-          <w:rFonts w:cstheme="minorHAnsi"/>
-          <w:b/>
-          <w:bCs/>
-          <w:highlight w:val="yellow"/>
-        </w:rPr>
-        <w:t xml:space="preserve"> et leur optimisation</w:t>
-      </w:r>
-      <w:r>
-        <w:rPr>
-          <w:rFonts w:cstheme="minorHAnsi"/>
-          <w:b/>
-          <w:bCs/>
-          <w:highlight w:val="yellow"/>
-        </w:rPr>
-        <w:t>.</w:t>
-      </w:r>
-    </w:p>
-    <w:p>
-      <w:pPr>
-        <w:rPr>
-          <w:rFonts w:ascii="Calibri" w:hAnsi="Calibri" w:cs="Calibri"/>
-          <w:b/>
-          <w:bCs/>
-          <w:color w:val="000000"/>
-        </w:rPr>
-      </w:pPr>
       <w:r>
         <w:rPr>
           <w:noProof/>
@@ -3873,6 +3873,59 @@
           </w:p>
           <w:p>
             <w:pPr>
+              <w:rPr>
+                <w:rFonts w:ascii="Calibri" w:hAnsi="Calibri" w:cs="Calibri"/>
+              </w:rPr>
+            </w:pPr>
+            <w:r>
+              <w:rPr>
+                <w:rFonts w:ascii="Calibri" w:hAnsi="Calibri" w:cs="Calibri"/>
+              </w:rPr>
+              <w:t>R1*=R1+R2</w:t>
+            </w:r>
+          </w:p>
+          <w:p>
+            <w:pPr>
+              <w:rPr>
+                <w:rFonts w:ascii="Calibri" w:hAnsi="Calibri" w:cs="Calibri"/>
+              </w:rPr>
+            </w:pPr>
+            <w:r>
+              <w:rPr>
+                <w:rFonts w:ascii="Calibri" w:hAnsi="Calibri" w:cs="Calibri"/>
+              </w:rPr>
+              <w:t>R2*=R3+R4</w:t>
+            </w:r>
+          </w:p>
+          <w:p>
+            <w:pPr>
+              <w:rPr>
+                <w:rFonts w:ascii="Calibri" w:hAnsi="Calibri" w:cs="Calibri"/>
+              </w:rPr>
+            </w:pPr>
+            <w:r>
+              <w:rPr>
+                <w:rFonts w:ascii="Calibri" w:hAnsi="Calibri" w:cs="Calibri"/>
+              </w:rPr>
+              <w:t>1/</w:t>
+            </w:r>
+            <w:proofErr w:type="spellStart"/>
+            <w:r>
+              <w:rPr>
+                <w:rFonts w:ascii="Calibri" w:hAnsi="Calibri" w:cs="Calibri"/>
+              </w:rPr>
+              <w:t>Rq</w:t>
+            </w:r>
+            <w:proofErr w:type="spellEnd"/>
+            <w:r>
+              <w:rPr>
+                <w:rFonts w:ascii="Calibri" w:hAnsi="Calibri" w:cs="Calibri"/>
+              </w:rPr>
+              <w:t>=1/R1*+1/R2*</w:t>
+            </w:r>
+          </w:p>
+          <w:p>
+            <w:pPr>
               <w:pStyle w:val="Paragraphedeliste"/>
               <w:rPr>
                 <w:rFonts w:ascii="Calibri" w:eastAsiaTheme="minorEastAsia" w:hAnsi="Calibri" w:cs="Calibri"/>
@@ -3897,67 +3950,79 @@
                 <w:lang w:eastAsia="ja-JP"/>
               </w:rPr>
             </w:pPr>
-            <w:r>
+          </w:p>
+          <w:p>
+            <w:pPr>
+              <w:pStyle w:val="Paragraphedeliste"/>
               <w:rPr>
                 <w:rFonts w:ascii="Calibri" w:eastAsiaTheme="minorEastAsia" w:hAnsi="Calibri" w:cs="Calibri"/>
                 <w:lang w:eastAsia="ja-JP"/>
               </w:rPr>
-              <w:t>1/r=1/r1 + 1/r2 + 1/r3 + 1/r4</w:t>
-            </w:r>
-          </w:p>
-          <w:p>
-            <w:pPr>
-              <w:pStyle w:val="Paragraphedeliste"/>
+            </w:pPr>
+            <w:r>
               <w:rPr>
                 <w:rFonts w:ascii="Calibri" w:eastAsiaTheme="minorEastAsia" w:hAnsi="Calibri" w:cs="Calibri"/>
                 <w:lang w:eastAsia="ja-JP"/>
               </w:rPr>
-            </w:pPr>
-          </w:p>
-          <w:p>
-            <w:pPr>
-              <w:pStyle w:val="Paragraphedeliste"/>
+              <w:t xml:space="preserve">L’algorithme va </w:t>
+            </w:r>
+            <w:proofErr w:type="spellStart"/>
+            <w:r>
               <w:rPr>
                 <w:rFonts w:ascii="Calibri" w:eastAsiaTheme="minorEastAsia" w:hAnsi="Calibri" w:cs="Calibri"/>
                 <w:lang w:eastAsia="ja-JP"/>
               </w:rPr>
-            </w:pPr>
-          </w:p>
-          <w:p>
-            <w:pPr>
-              <w:pStyle w:val="Paragraphedeliste"/>
+              <w:t>séprarer</w:t>
+            </w:r>
+            <w:proofErr w:type="spellEnd"/>
+            <w:r>
               <w:rPr>
                 <w:rFonts w:ascii="Calibri" w:eastAsiaTheme="minorEastAsia" w:hAnsi="Calibri" w:cs="Calibri"/>
                 <w:lang w:eastAsia="ja-JP"/>
               </w:rPr>
-            </w:pPr>
-          </w:p>
-          <w:p>
-            <w:pPr>
-              <w:pStyle w:val="Paragraphedeliste"/>
+              <w:t xml:space="preserve"> le circuit jusqu’à ça soit </w:t>
+            </w:r>
+            <w:proofErr w:type="gramStart"/>
+            <w:r>
               <w:rPr>
                 <w:rFonts w:ascii="Calibri" w:eastAsiaTheme="minorEastAsia" w:hAnsi="Calibri" w:cs="Calibri"/>
                 <w:lang w:eastAsia="ja-JP"/>
               </w:rPr>
-            </w:pPr>
-          </w:p>
-          <w:p>
-            <w:pPr>
-              <w:pStyle w:val="Paragraphedeliste"/>
+              <w:t>plusieurs circuit</w:t>
+            </w:r>
+            <w:proofErr w:type="gramEnd"/>
+            <w:r>
               <w:rPr>
                 <w:rFonts w:ascii="Calibri" w:eastAsiaTheme="minorEastAsia" w:hAnsi="Calibri" w:cs="Calibri"/>
                 <w:lang w:eastAsia="ja-JP"/>
               </w:rPr>
-            </w:pPr>
-          </w:p>
-          <w:p>
-            <w:pPr>
-              <w:pStyle w:val="Paragraphedeliste"/>
+              <w:t xml:space="preserve"> en série, ensuite il va </w:t>
+            </w:r>
+            <w:proofErr w:type="spellStart"/>
+            <w:r>
               <w:rPr>
                 <w:rFonts w:ascii="Calibri" w:eastAsiaTheme="minorEastAsia" w:hAnsi="Calibri" w:cs="Calibri"/>
                 <w:lang w:eastAsia="ja-JP"/>
               </w:rPr>
-            </w:pPr>
+              <w:t>calcluler</w:t>
+            </w:r>
+            <w:proofErr w:type="spellEnd"/>
+            <w:r>
+              <w:rPr>
+                <w:rFonts w:ascii="Calibri" w:eastAsiaTheme="minorEastAsia" w:hAnsi="Calibri" w:cs="Calibri"/>
+                <w:lang w:eastAsia="ja-JP"/>
+              </w:rPr>
+              <w:t xml:space="preserve"> chacune </w:t>
+            </w:r>
+            <w:proofErr w:type="gramStart"/>
+            <w:r>
+              <w:rPr>
+                <w:rFonts w:ascii="Calibri" w:eastAsiaTheme="minorEastAsia" w:hAnsi="Calibri" w:cs="Calibri"/>
+                <w:lang w:eastAsia="ja-JP"/>
+              </w:rPr>
+              <w:t>des résistance</w:t>
+            </w:r>
+            <w:proofErr w:type="gramEnd"/>
           </w:p>
           <w:p>
             <w:pPr>
@@ -4067,7 +4132,6 @@
           <w:sz w:val="24"/>
           <w:szCs w:val="24"/>
         </w:rPr>
-        <w:lastRenderedPageBreak/>
         <w:t>O</w:t>
       </w:r>
       <w:r>

</xml_diff>